<commit_message>
fix: minor tweaks to produce nicer final document
</commit_message>
<xml_diff>
--- a/docs/sample-template.docx
+++ b/docs/sample-template.docx
@@ -91,7 +91,25 @@
           <w:sz w:val="24"/>
           <w:szCs w:val="24"/>
         </w:rPr>
-        <w:t xml:space="preserve"> </w:t>
+        <w:t xml:space="preserve"> Dagmar </w:t>
+      </w:r>
+      <w:proofErr w:type="spellStart"/>
+      <w:r>
+        <w:rPr>
+          <w:b w:val="0"/>
+          <w:sz w:val="24"/>
+          <w:szCs w:val="24"/>
+        </w:rPr>
+        <w:t>Bukovska</w:t>
+      </w:r>
+      <w:proofErr w:type="spellEnd"/>
+      <w:r>
+        <w:rPr>
+          <w:b w:val="0"/>
+          <w:sz w:val="24"/>
+          <w:szCs w:val="24"/>
+        </w:rPr>
+        <w:t xml:space="preserve"> (Dasha)</w:t>
       </w:r>
     </w:p>
     <w:p>
@@ -122,6 +140,14 @@
           <w:szCs w:val="24"/>
         </w:rPr>
         <w:t xml:space="preserve">Faculty: </w:t>
+      </w:r>
+      <w:r>
+        <w:rPr>
+          <w:b w:val="0"/>
+          <w:sz w:val="24"/>
+          <w:szCs w:val="24"/>
+        </w:rPr>
+        <w:t>Prof. Pawlak and others</w:t>
       </w:r>
     </w:p>
     <w:p>
@@ -1124,6 +1150,14 @@
           <w:sz w:val="24"/>
           <w:szCs w:val="24"/>
         </w:rPr>
+        <w:t xml:space="preserve"> | lower</w:t>
+      </w:r>
+      <w:r>
+        <w:rPr>
+          <w:b w:val="0"/>
+          <w:sz w:val="24"/>
+          <w:szCs w:val="24"/>
+        </w:rPr>
         <w:t>}</w:t>
       </w:r>
     </w:p>
@@ -1204,7 +1238,102 @@
           <w:sz w:val="24"/>
           <w:szCs w:val="24"/>
         </w:rPr>
-        <w:t>: {</w:t>
+        <w:t xml:space="preserve">: </w:t>
+      </w:r>
+    </w:p>
+    <w:p>
+      <w:pPr>
+        <w:pStyle w:val="Title"/>
+        <w:numPr>
+          <w:ilvl w:val="1"/>
+          <w:numId w:val="4"/>
+        </w:numPr>
+        <w:jc w:val="left"/>
+        <w:rPr>
+          <w:b w:val="0"/>
+          <w:sz w:val="24"/>
+          <w:szCs w:val="24"/>
+        </w:rPr>
+      </w:pPr>
+      <w:r>
+        <w:rPr>
+          <w:b w:val="0"/>
+          <w:sz w:val="24"/>
+          <w:szCs w:val="24"/>
+        </w:rPr>
+        <w:t>{</w:t>
+      </w:r>
+      <w:r>
+        <w:rPr>
+          <w:b w:val="0"/>
+          <w:sz w:val="24"/>
+          <w:szCs w:val="24"/>
+        </w:rPr>
+        <w:t>#</w:t>
+      </w:r>
+      <w:proofErr w:type="gramStart"/>
+      <w:r>
+        <w:rPr>
+          <w:b w:val="0"/>
+          <w:sz w:val="24"/>
+          <w:szCs w:val="24"/>
+        </w:rPr>
+        <w:t>objective.medical</w:t>
+      </w:r>
+      <w:proofErr w:type="gramEnd"/>
+      <w:r>
+        <w:rPr>
+          <w:b w:val="0"/>
+          <w:sz w:val="24"/>
+          <w:szCs w:val="24"/>
+        </w:rPr>
+        <w:t>.referrals}</w:t>
+      </w:r>
+    </w:p>
+    <w:p>
+      <w:pPr>
+        <w:pStyle w:val="Title"/>
+        <w:numPr>
+          <w:ilvl w:val="1"/>
+          <w:numId w:val="4"/>
+        </w:numPr>
+        <w:jc w:val="left"/>
+        <w:rPr>
+          <w:b w:val="0"/>
+          <w:sz w:val="24"/>
+          <w:szCs w:val="24"/>
+        </w:rPr>
+      </w:pPr>
+      <w:r>
+        <w:rPr>
+          <w:b w:val="0"/>
+          <w:sz w:val="24"/>
+          <w:szCs w:val="24"/>
+        </w:rPr>
+        <w:t>{.}</w:t>
+      </w:r>
+    </w:p>
+    <w:p>
+      <w:pPr>
+        <w:pStyle w:val="Title"/>
+        <w:numPr>
+          <w:ilvl w:val="1"/>
+          <w:numId w:val="4"/>
+        </w:numPr>
+        <w:jc w:val="left"/>
+        <w:rPr>
+          <w:b w:val="0"/>
+          <w:sz w:val="24"/>
+          <w:szCs w:val="24"/>
+        </w:rPr>
+      </w:pPr>
+      <w:r>
+        <w:rPr>
+          <w:b w:val="0"/>
+          <w:sz w:val="24"/>
+          <w:szCs w:val="24"/>
+        </w:rPr>
+        <w:t>{/</w:t>
       </w:r>
       <w:proofErr w:type="spellStart"/>
       <w:proofErr w:type="gramStart"/>
@@ -1263,43 +1392,6 @@
           <w:szCs w:val="24"/>
         </w:rPr>
         <w:t xml:space="preserve">EOE &amp; IOE </w:t>
-      </w:r>
-    </w:p>
-    <w:p>
-      <w:pPr>
-        <w:pStyle w:val="Title"/>
-        <w:jc w:val="left"/>
-        <w:rPr>
-          <w:b w:val="0"/>
-          <w:sz w:val="24"/>
-          <w:szCs w:val="24"/>
-        </w:rPr>
-      </w:pPr>
-      <w:r>
-        <w:rPr>
-          <w:b w:val="0"/>
-          <w:sz w:val="24"/>
-          <w:szCs w:val="24"/>
-        </w:rPr>
-        <w:t>{#</w:t>
-      </w:r>
-      <w:proofErr w:type="gramStart"/>
-      <w:r>
-        <w:rPr>
-          <w:b w:val="0"/>
-          <w:sz w:val="24"/>
-          <w:szCs w:val="24"/>
-        </w:rPr>
-        <w:t>objective.exams</w:t>
-      </w:r>
-      <w:proofErr w:type="gramEnd"/>
-      <w:r>
-        <w:rPr>
-          <w:b w:val="0"/>
-          <w:sz w:val="24"/>
-          <w:szCs w:val="24"/>
-        </w:rPr>
-        <w:t>.findings}</w:t>
       </w:r>
     </w:p>
     <w:p>
@@ -1322,26 +1414,7 @@
           <w:sz w:val="24"/>
           <w:szCs w:val="24"/>
         </w:rPr>
-        <w:t>{.}</w:t>
-      </w:r>
-    </w:p>
-    <w:p>
-      <w:pPr>
-        <w:pStyle w:val="Title"/>
-        <w:jc w:val="left"/>
-        <w:rPr>
-          <w:b w:val="0"/>
-          <w:sz w:val="24"/>
-          <w:szCs w:val="24"/>
-        </w:rPr>
-      </w:pPr>
-      <w:r>
-        <w:rPr>
-          <w:b w:val="0"/>
-          <w:sz w:val="24"/>
-          <w:szCs w:val="24"/>
-        </w:rPr>
-        <w:t>{/</w:t>
+        <w:t>{</w:t>
       </w:r>
       <w:proofErr w:type="spellStart"/>
       <w:proofErr w:type="gramStart"/>
@@ -1392,7 +1465,94 @@
           <w:sz w:val="24"/>
           <w:szCs w:val="24"/>
         </w:rPr>
-        <w:t>Need for referrals: {</w:t>
+        <w:t>Need for referrals:</w:t>
+      </w:r>
+    </w:p>
+    <w:p>
+      <w:pPr>
+        <w:pStyle w:val="Title"/>
+        <w:numPr>
+          <w:ilvl w:val="1"/>
+          <w:numId w:val="5"/>
+        </w:numPr>
+        <w:jc w:val="left"/>
+        <w:rPr>
+          <w:b w:val="0"/>
+          <w:sz w:val="24"/>
+          <w:szCs w:val="24"/>
+        </w:rPr>
+      </w:pPr>
+      <w:r>
+        <w:rPr>
+          <w:b w:val="0"/>
+          <w:sz w:val="24"/>
+          <w:szCs w:val="24"/>
+        </w:rPr>
+        <w:t>{#</w:t>
+      </w:r>
+      <w:proofErr w:type="gramStart"/>
+      <w:r>
+        <w:rPr>
+          <w:b w:val="0"/>
+          <w:sz w:val="24"/>
+          <w:szCs w:val="24"/>
+        </w:rPr>
+        <w:t>objective.exams</w:t>
+      </w:r>
+      <w:proofErr w:type="gramEnd"/>
+      <w:r>
+        <w:rPr>
+          <w:b w:val="0"/>
+          <w:sz w:val="24"/>
+          <w:szCs w:val="24"/>
+        </w:rPr>
+        <w:t>.referrals}</w:t>
+      </w:r>
+    </w:p>
+    <w:p>
+      <w:pPr>
+        <w:pStyle w:val="Title"/>
+        <w:numPr>
+          <w:ilvl w:val="1"/>
+          <w:numId w:val="5"/>
+        </w:numPr>
+        <w:jc w:val="left"/>
+        <w:rPr>
+          <w:b w:val="0"/>
+          <w:sz w:val="24"/>
+          <w:szCs w:val="24"/>
+        </w:rPr>
+      </w:pPr>
+      <w:r>
+        <w:rPr>
+          <w:b w:val="0"/>
+          <w:sz w:val="24"/>
+          <w:szCs w:val="24"/>
+        </w:rPr>
+        <w:t>{.}</w:t>
+      </w:r>
+    </w:p>
+    <w:p>
+      <w:pPr>
+        <w:pStyle w:val="Title"/>
+        <w:numPr>
+          <w:ilvl w:val="1"/>
+          <w:numId w:val="5"/>
+        </w:numPr>
+        <w:jc w:val="left"/>
+        <w:rPr>
+          <w:b w:val="0"/>
+          <w:sz w:val="24"/>
+          <w:szCs w:val="24"/>
+        </w:rPr>
+      </w:pPr>
+      <w:r>
+        <w:rPr>
+          <w:b w:val="0"/>
+          <w:sz w:val="24"/>
+          <w:szCs w:val="24"/>
+        </w:rPr>
+        <w:t>{/</w:t>
       </w:r>
       <w:proofErr w:type="spellStart"/>
       <w:proofErr w:type="gramStart"/>
@@ -1402,7 +1562,15 @@
           <w:sz w:val="24"/>
           <w:szCs w:val="24"/>
         </w:rPr>
-        <w:t>objective.exams</w:t>
+        <w:t>objective.</w:t>
+      </w:r>
+      <w:r>
+        <w:rPr>
+          <w:b w:val="0"/>
+          <w:sz w:val="24"/>
+          <w:szCs w:val="24"/>
+        </w:rPr>
+        <w:t>exams</w:t>
       </w:r>
       <w:proofErr w:type="gramEnd"/>
       <w:r>
@@ -1411,15 +1579,7 @@
           <w:sz w:val="24"/>
           <w:szCs w:val="24"/>
         </w:rPr>
-        <w:t>.referral</w:t>
-      </w:r>
-      <w:r>
-        <w:rPr>
-          <w:b w:val="0"/>
-          <w:sz w:val="24"/>
-          <w:szCs w:val="24"/>
-        </w:rPr>
-        <w:t>s</w:t>
+        <w:t>.referrals</w:t>
       </w:r>
       <w:proofErr w:type="spellEnd"/>
       <w:r>
@@ -1717,15 +1877,95 @@
           <w:sz w:val="24"/>
           <w:szCs w:val="24"/>
         </w:rPr>
-        <w:t xml:space="preserve">Need for referral: </w:t>
-      </w:r>
-      <w:r>
-        <w:rPr>
-          <w:b w:val="0"/>
-          <w:sz w:val="24"/>
-          <w:szCs w:val="24"/>
-        </w:rPr>
-        <w:t>{</w:t>
+        <w:t>Need for referral:</w:t>
+      </w:r>
+    </w:p>
+    <w:p>
+      <w:pPr>
+        <w:pStyle w:val="Title"/>
+        <w:numPr>
+          <w:ilvl w:val="1"/>
+          <w:numId w:val="3"/>
+        </w:numPr>
+        <w:jc w:val="left"/>
+        <w:rPr>
+          <w:b w:val="0"/>
+          <w:sz w:val="24"/>
+          <w:szCs w:val="24"/>
+        </w:rPr>
+      </w:pPr>
+      <w:r>
+        <w:rPr>
+          <w:b w:val="0"/>
+          <w:sz w:val="24"/>
+          <w:szCs w:val="24"/>
+        </w:rPr>
+        <w:t>{#</w:t>
+      </w:r>
+      <w:proofErr w:type="gramStart"/>
+      <w:r>
+        <w:rPr>
+          <w:b w:val="0"/>
+          <w:sz w:val="24"/>
+          <w:szCs w:val="24"/>
+        </w:rPr>
+        <w:t>objective.restorative</w:t>
+      </w:r>
+      <w:proofErr w:type="gramEnd"/>
+      <w:r>
+        <w:rPr>
+          <w:b w:val="0"/>
+          <w:sz w:val="24"/>
+          <w:szCs w:val="24"/>
+        </w:rPr>
+        <w:t>.referrals}</w:t>
+      </w:r>
+    </w:p>
+    <w:p>
+      <w:pPr>
+        <w:pStyle w:val="Title"/>
+        <w:numPr>
+          <w:ilvl w:val="1"/>
+          <w:numId w:val="3"/>
+        </w:numPr>
+        <w:jc w:val="left"/>
+        <w:rPr>
+          <w:b w:val="0"/>
+          <w:sz w:val="24"/>
+          <w:szCs w:val="24"/>
+        </w:rPr>
+      </w:pPr>
+      <w:r>
+        <w:rPr>
+          <w:b w:val="0"/>
+          <w:sz w:val="24"/>
+          <w:szCs w:val="24"/>
+        </w:rPr>
+        <w:t>{.}</w:t>
+      </w:r>
+    </w:p>
+    <w:p>
+      <w:pPr>
+        <w:pStyle w:val="Title"/>
+        <w:numPr>
+          <w:ilvl w:val="1"/>
+          <w:numId w:val="3"/>
+        </w:numPr>
+        <w:jc w:val="left"/>
+        <w:rPr>
+          <w:b w:val="0"/>
+          <w:sz w:val="24"/>
+          <w:szCs w:val="24"/>
+        </w:rPr>
+      </w:pPr>
+      <w:r>
+        <w:rPr>
+          <w:b w:val="0"/>
+          <w:sz w:val="24"/>
+          <w:szCs w:val="24"/>
+        </w:rPr>
+        <w:lastRenderedPageBreak/>
+        <w:t>{/</w:t>
       </w:r>
       <w:proofErr w:type="spellStart"/>
       <w:proofErr w:type="gramStart"/>
@@ -1735,7 +1975,15 @@
           <w:sz w:val="24"/>
           <w:szCs w:val="24"/>
         </w:rPr>
-        <w:t>objective.restorative</w:t>
+        <w:t>objective.</w:t>
+      </w:r>
+      <w:r>
+        <w:rPr>
+          <w:b w:val="0"/>
+          <w:sz w:val="24"/>
+          <w:szCs w:val="24"/>
+        </w:rPr>
+        <w:t>restorative</w:t>
       </w:r>
       <w:proofErr w:type="gramEnd"/>
       <w:r>
@@ -1973,7 +2221,6 @@
           <w:sz w:val="24"/>
           <w:szCs w:val="24"/>
         </w:rPr>
-        <w:lastRenderedPageBreak/>
         <w:t>GI</w:t>
       </w:r>
       <w:r>
@@ -2054,7 +2301,38 @@
           <w:sz w:val="24"/>
           <w:szCs w:val="24"/>
         </w:rPr>
-        <w:t>Need for referrals: {</w:t>
+        <w:t>Need for referrals:</w:t>
+      </w:r>
+    </w:p>
+    <w:p>
+      <w:pPr>
+        <w:pStyle w:val="Title"/>
+        <w:numPr>
+          <w:ilvl w:val="1"/>
+          <w:numId w:val="6"/>
+        </w:numPr>
+        <w:jc w:val="left"/>
+        <w:rPr>
+          <w:b w:val="0"/>
+          <w:sz w:val="24"/>
+          <w:szCs w:val="24"/>
+        </w:rPr>
+      </w:pPr>
+      <w:r>
+        <w:rPr>
+          <w:b w:val="0"/>
+          <w:sz w:val="24"/>
+          <w:szCs w:val="24"/>
+        </w:rPr>
+        <w:t>{#objective.</w:t>
+      </w:r>
+      <w:r>
+        <w:rPr>
+          <w:b w:val="0"/>
+          <w:sz w:val="24"/>
+          <w:szCs w:val="24"/>
+        </w:rPr>
+        <w:t xml:space="preserve"> </w:t>
       </w:r>
       <w:proofErr w:type="spellStart"/>
       <w:proofErr w:type="gramStart"/>
@@ -2064,8 +2342,9 @@
           <w:sz w:val="24"/>
           <w:szCs w:val="24"/>
         </w:rPr>
-        <w:t>objective.periodontal</w:t>
-      </w:r>
+        <w:t>periodontal.referrals</w:t>
+      </w:r>
+      <w:proofErr w:type="spellEnd"/>
       <w:proofErr w:type="gramEnd"/>
       <w:r>
         <w:rPr>
@@ -2073,46 +2352,61 @@
           <w:sz w:val="24"/>
           <w:szCs w:val="24"/>
         </w:rPr>
-        <w:t>.referrals</w:t>
-      </w:r>
-      <w:proofErr w:type="spellEnd"/>
-      <w:r>
-        <w:rPr>
-          <w:b w:val="0"/>
-          <w:sz w:val="24"/>
-          <w:szCs w:val="24"/>
-        </w:rPr>
         <w:t>}</w:t>
       </w:r>
     </w:p>
     <w:p>
       <w:pPr>
         <w:pStyle w:val="Title"/>
-        <w:jc w:val="left"/>
-        <w:rPr>
-          <w:b w:val="0"/>
-          <w:sz w:val="24"/>
-          <w:szCs w:val="24"/>
-        </w:rPr>
-      </w:pPr>
-    </w:p>
-    <w:p>
-      <w:pPr>
-        <w:pStyle w:val="Title"/>
-        <w:jc w:val="left"/>
-        <w:rPr>
-          <w:b w:val="0"/>
-          <w:sz w:val="24"/>
-          <w:szCs w:val="24"/>
-        </w:rPr>
-      </w:pPr>
-      <w:r>
-        <w:rPr>
-          <w:b w:val="0"/>
-          <w:sz w:val="24"/>
-          <w:szCs w:val="24"/>
-        </w:rPr>
-        <w:t>Radiographic Needs: {</w:t>
+        <w:numPr>
+          <w:ilvl w:val="1"/>
+          <w:numId w:val="6"/>
+        </w:numPr>
+        <w:jc w:val="left"/>
+        <w:rPr>
+          <w:b w:val="0"/>
+          <w:sz w:val="24"/>
+          <w:szCs w:val="24"/>
+        </w:rPr>
+      </w:pPr>
+      <w:r>
+        <w:rPr>
+          <w:b w:val="0"/>
+          <w:sz w:val="24"/>
+          <w:szCs w:val="24"/>
+        </w:rPr>
+        <w:t>{.}</w:t>
+      </w:r>
+    </w:p>
+    <w:p>
+      <w:pPr>
+        <w:pStyle w:val="Title"/>
+        <w:numPr>
+          <w:ilvl w:val="1"/>
+          <w:numId w:val="6"/>
+        </w:numPr>
+        <w:jc w:val="left"/>
+        <w:rPr>
+          <w:b w:val="0"/>
+          <w:sz w:val="24"/>
+          <w:szCs w:val="24"/>
+        </w:rPr>
+      </w:pPr>
+      <w:r>
+        <w:rPr>
+          <w:b w:val="0"/>
+          <w:sz w:val="24"/>
+          <w:szCs w:val="24"/>
+        </w:rPr>
+        <w:t>{/objective.</w:t>
+      </w:r>
+      <w:r>
+        <w:rPr>
+          <w:b w:val="0"/>
+          <w:sz w:val="24"/>
+          <w:szCs w:val="24"/>
+        </w:rPr>
+        <w:t xml:space="preserve"> </w:t>
       </w:r>
       <w:proofErr w:type="spellStart"/>
       <w:proofErr w:type="gramStart"/>
@@ -2122,7 +2416,7 @@
           <w:sz w:val="24"/>
           <w:szCs w:val="24"/>
         </w:rPr>
-        <w:t>objective.radiographic</w:t>
+        <w:t>periodontal.referrals</w:t>
       </w:r>
       <w:proofErr w:type="spellEnd"/>
       <w:proofErr w:type="gramEnd"/>
@@ -2162,15 +2456,30 @@
           <w:sz w:val="24"/>
           <w:szCs w:val="24"/>
         </w:rPr>
-        <w:t>Further Diagnostic Needs:</w:t>
-      </w:r>
-      <w:r>
-        <w:rPr>
-          <w:b w:val="0"/>
-          <w:sz w:val="24"/>
-          <w:szCs w:val="24"/>
-        </w:rPr>
-        <w:t xml:space="preserve"> {</w:t>
+        <w:t>Radiographic Needs:</w:t>
+      </w:r>
+    </w:p>
+    <w:p>
+      <w:pPr>
+        <w:pStyle w:val="Title"/>
+        <w:numPr>
+          <w:ilvl w:val="0"/>
+          <w:numId w:val="19"/>
+        </w:numPr>
+        <w:jc w:val="left"/>
+        <w:rPr>
+          <w:b w:val="0"/>
+          <w:sz w:val="24"/>
+          <w:szCs w:val="24"/>
+        </w:rPr>
+      </w:pPr>
+      <w:r>
+        <w:rPr>
+          <w:b w:val="0"/>
+          <w:sz w:val="24"/>
+          <w:szCs w:val="24"/>
+        </w:rPr>
+        <w:t>{</w:t>
       </w:r>
       <w:proofErr w:type="spellStart"/>
       <w:proofErr w:type="gramStart"/>
@@ -2180,7 +2489,7 @@
           <w:sz w:val="24"/>
           <w:szCs w:val="24"/>
         </w:rPr>
-        <w:t>objective.diagnostic</w:t>
+        <w:t>objective.radiographic</w:t>
       </w:r>
       <w:proofErr w:type="spellEnd"/>
       <w:proofErr w:type="gramEnd"/>
@@ -2198,6 +2507,79 @@
         <w:pStyle w:val="Title"/>
         <w:jc w:val="left"/>
         <w:rPr>
+          <w:b w:val="0"/>
+          <w:sz w:val="24"/>
+          <w:szCs w:val="24"/>
+        </w:rPr>
+      </w:pPr>
+    </w:p>
+    <w:p>
+      <w:pPr>
+        <w:pStyle w:val="Title"/>
+        <w:jc w:val="left"/>
+        <w:rPr>
+          <w:b w:val="0"/>
+          <w:sz w:val="24"/>
+          <w:szCs w:val="24"/>
+        </w:rPr>
+      </w:pPr>
+      <w:r>
+        <w:rPr>
+          <w:b w:val="0"/>
+          <w:sz w:val="24"/>
+          <w:szCs w:val="24"/>
+        </w:rPr>
+        <w:t>Further Diagnostic Needs:</w:t>
+      </w:r>
+    </w:p>
+    <w:p>
+      <w:pPr>
+        <w:pStyle w:val="Title"/>
+        <w:numPr>
+          <w:ilvl w:val="0"/>
+          <w:numId w:val="19"/>
+        </w:numPr>
+        <w:jc w:val="left"/>
+        <w:rPr>
+          <w:b w:val="0"/>
+          <w:sz w:val="24"/>
+          <w:szCs w:val="24"/>
+        </w:rPr>
+      </w:pPr>
+      <w:r>
+        <w:rPr>
+          <w:b w:val="0"/>
+          <w:sz w:val="24"/>
+          <w:szCs w:val="24"/>
+        </w:rPr>
+        <w:t>{</w:t>
+      </w:r>
+      <w:proofErr w:type="spellStart"/>
+      <w:proofErr w:type="gramStart"/>
+      <w:r>
+        <w:rPr>
+          <w:b w:val="0"/>
+          <w:sz w:val="24"/>
+          <w:szCs w:val="24"/>
+        </w:rPr>
+        <w:t>objective.diagnostic</w:t>
+      </w:r>
+      <w:proofErr w:type="spellEnd"/>
+      <w:proofErr w:type="gramEnd"/>
+      <w:r>
+        <w:rPr>
+          <w:b w:val="0"/>
+          <w:sz w:val="24"/>
+          <w:szCs w:val="24"/>
+        </w:rPr>
+        <w:t>}</w:t>
+      </w:r>
+    </w:p>
+    <w:p>
+      <w:pPr>
+        <w:pStyle w:val="Title"/>
+        <w:jc w:val="left"/>
+        <w:rPr>
           <w:bCs/>
           <w:sz w:val="24"/>
           <w:szCs w:val="24"/>
@@ -2227,17 +2609,6 @@
         <w:pStyle w:val="Title"/>
         <w:jc w:val="left"/>
         <w:rPr>
-          <w:bCs/>
-          <w:sz w:val="24"/>
-          <w:szCs w:val="24"/>
-        </w:rPr>
-      </w:pPr>
-    </w:p>
-    <w:p>
-      <w:pPr>
-        <w:pStyle w:val="Title"/>
-        <w:jc w:val="left"/>
-        <w:rPr>
           <w:b w:val="0"/>
           <w:sz w:val="24"/>
           <w:szCs w:val="24"/>
@@ -2267,6 +2638,17 @@
         </w:rPr>
         <w:t>}</w:t>
       </w:r>
+    </w:p>
+    <w:p>
+      <w:pPr>
+        <w:pStyle w:val="Title"/>
+        <w:jc w:val="left"/>
+        <w:rPr>
+          <w:b w:val="0"/>
+          <w:sz w:val="24"/>
+          <w:szCs w:val="24"/>
+        </w:rPr>
+      </w:pPr>
     </w:p>
     <w:tbl>
       <w:tblPr>
@@ -2278,10 +2660,13 @@
         <w:tblLook w:val="06A0" w:firstRow="1" w:lastRow="0" w:firstColumn="1" w:lastColumn="0" w:noHBand="1" w:noVBand="1"/>
       </w:tblPr>
       <w:tblGrid>
-        <w:gridCol w:w="3142"/>
-        <w:gridCol w:w="7642"/>
+        <w:gridCol w:w="2422"/>
+        <w:gridCol w:w="8362"/>
       </w:tblGrid>
       <w:tr>
+        <w:trPr>
+          <w:cantSplit/>
+        </w:trPr>
         <w:tc>
           <w:tcPr>
             <w:tcW w:w="10784" w:type="dxa"/>
@@ -2311,6 +2696,14 @@
               </w:rPr>
               <w:t>Condition:</w:t>
             </w:r>
+            <w:r>
+              <w:rPr>
+                <w:rFonts w:eastAsia="Arial"/>
+                <w:b/>
+                <w:bCs/>
+              </w:rPr>
+              <w:t xml:space="preserve"> {name}</w:t>
+            </w:r>
           </w:p>
           <w:p>
             <w:r>
@@ -2322,7 +2715,7 @@
       <w:tr>
         <w:tc>
           <w:tcPr>
-            <w:tcW w:w="3142" w:type="dxa"/>
+            <w:tcW w:w="2422" w:type="dxa"/>
             <w:tcBorders>
               <w:top w:val="single" w:sz="6" w:space="0" w:color="000000" w:themeColor="text1"/>
               <w:left w:val="single" w:sz="6" w:space="0" w:color="000000" w:themeColor="text1"/>
@@ -2349,7 +2742,7 @@
         </w:tc>
         <w:tc>
           <w:tcPr>
-            <w:tcW w:w="7642" w:type="dxa"/>
+            <w:tcW w:w="8362" w:type="dxa"/>
             <w:tcBorders>
               <w:top w:val="single" w:sz="6" w:space="0" w:color="000000" w:themeColor="text1"/>
               <w:left w:val="single" w:sz="6" w:space="0" w:color="000000" w:themeColor="text1"/>
@@ -2368,7 +2761,7 @@
       <w:tr>
         <w:tc>
           <w:tcPr>
-            <w:tcW w:w="3142" w:type="dxa"/>
+            <w:tcW w:w="2422" w:type="dxa"/>
             <w:tcBorders>
               <w:top w:val="single" w:sz="6" w:space="0" w:color="000000" w:themeColor="text1"/>
               <w:left w:val="single" w:sz="6" w:space="0" w:color="000000" w:themeColor="text1"/>
@@ -2395,7 +2788,7 @@
         </w:tc>
         <w:tc>
           <w:tcPr>
-            <w:tcW w:w="7642" w:type="dxa"/>
+            <w:tcW w:w="8362" w:type="dxa"/>
             <w:tcBorders>
               <w:top w:val="single" w:sz="6" w:space="0" w:color="000000" w:themeColor="text1"/>
               <w:left w:val="single" w:sz="6" w:space="0" w:color="000000" w:themeColor="text1"/>
@@ -2414,7 +2807,7 @@
       <w:tr>
         <w:tc>
           <w:tcPr>
-            <w:tcW w:w="3142" w:type="dxa"/>
+            <w:tcW w:w="2422" w:type="dxa"/>
             <w:tcBorders>
               <w:top w:val="single" w:sz="6" w:space="0" w:color="000000" w:themeColor="text1"/>
               <w:left w:val="single" w:sz="6" w:space="0" w:color="000000" w:themeColor="text1"/>
@@ -2441,7 +2834,7 @@
         </w:tc>
         <w:tc>
           <w:tcPr>
-            <w:tcW w:w="7642" w:type="dxa"/>
+            <w:tcW w:w="8362" w:type="dxa"/>
             <w:tcBorders>
               <w:top w:val="single" w:sz="6" w:space="0" w:color="000000" w:themeColor="text1"/>
               <w:left w:val="single" w:sz="6" w:space="0" w:color="000000" w:themeColor="text1"/>
@@ -2460,7 +2853,7 @@
       <w:tr>
         <w:tc>
           <w:tcPr>
-            <w:tcW w:w="3142" w:type="dxa"/>
+            <w:tcW w:w="2422" w:type="dxa"/>
             <w:tcBorders>
               <w:top w:val="single" w:sz="6" w:space="0" w:color="000000" w:themeColor="text1"/>
               <w:left w:val="single" w:sz="6" w:space="0" w:color="000000" w:themeColor="text1"/>
@@ -2487,7 +2880,7 @@
         </w:tc>
         <w:tc>
           <w:tcPr>
-            <w:tcW w:w="7642" w:type="dxa"/>
+            <w:tcW w:w="8362" w:type="dxa"/>
             <w:tcBorders>
               <w:top w:val="single" w:sz="6" w:space="0" w:color="000000" w:themeColor="text1"/>
               <w:left w:val="single" w:sz="6" w:space="0" w:color="000000" w:themeColor="text1"/>
@@ -2506,7 +2899,7 @@
       <w:tr>
         <w:tc>
           <w:tcPr>
-            <w:tcW w:w="3142" w:type="dxa"/>
+            <w:tcW w:w="2422" w:type="dxa"/>
             <w:tcBorders>
               <w:top w:val="single" w:sz="6" w:space="0" w:color="000000" w:themeColor="text1"/>
               <w:left w:val="single" w:sz="6" w:space="0" w:color="000000" w:themeColor="text1"/>
@@ -2533,7 +2926,7 @@
         </w:tc>
         <w:tc>
           <w:tcPr>
-            <w:tcW w:w="7642" w:type="dxa"/>
+            <w:tcW w:w="8362" w:type="dxa"/>
             <w:tcBorders>
               <w:top w:val="single" w:sz="6" w:space="0" w:color="000000" w:themeColor="text1"/>
               <w:left w:val="single" w:sz="6" w:space="0" w:color="000000" w:themeColor="text1"/>
@@ -2851,6 +3244,14 @@
               </w:rPr>
               <w:t>}</w:t>
             </w:r>
+            <w:r>
+              <w:rPr>
+                <w:b w:val="0"/>
+                <w:sz w:val="24"/>
+                <w:szCs w:val="24"/>
+              </w:rPr>
+              <w:t>.</w:t>
+            </w:r>
           </w:p>
           <w:p>
             <w:pPr>
@@ -2898,6 +3299,14 @@
                 <w:szCs w:val="24"/>
               </w:rPr>
               <w:t>}</w:t>
+            </w:r>
+            <w:r>
+              <w:rPr>
+                <w:b w:val="0"/>
+                <w:sz w:val="24"/>
+                <w:szCs w:val="24"/>
+              </w:rPr>
+              <w:t>.</w:t>
             </w:r>
           </w:p>
         </w:tc>
@@ -3371,7 +3780,6 @@
           <w:sz w:val="24"/>
           <w:szCs w:val="24"/>
         </w:rPr>
-        <w:lastRenderedPageBreak/>
         <w:t xml:space="preserve">The client has the need for </w:t>
       </w:r>
       <w:r>
@@ -4548,7 +4956,7 @@
         <w:rFonts w:ascii="Symbol" w:hAnsi="Symbol" w:hint="default"/>
       </w:rPr>
     </w:lvl>
-    <w:lvl w:ilvl="1" w:tplc="04090003" w:tentative="1">
+    <w:lvl w:ilvl="1" w:tplc="04090003">
       <w:start w:val="1"/>
       <w:numFmt w:val="bullet"/>
       <w:lvlText w:val="o"/>
@@ -4646,6 +5054,119 @@
     </w:lvl>
   </w:abstractNum>
   <w:abstractNum w:abstractNumId="1" w15:restartNumberingAfterBreak="0">
+    <w:nsid w:val="129043AB"/>
+    <w:multiLevelType w:val="hybridMultilevel"/>
+    <w:tmpl w:val="30EA102E"/>
+    <w:lvl w:ilvl="0" w:tplc="04090001">
+      <w:start w:val="1"/>
+      <w:numFmt w:val="bullet"/>
+      <w:lvlText w:val=""/>
+      <w:lvlJc w:val="left"/>
+      <w:pPr>
+        <w:ind w:left="720" w:hanging="360"/>
+      </w:pPr>
+      <w:rPr>
+        <w:rFonts w:ascii="Symbol" w:hAnsi="Symbol" w:hint="default"/>
+      </w:rPr>
+    </w:lvl>
+    <w:lvl w:ilvl="1" w:tplc="04090003" w:tentative="1">
+      <w:start w:val="1"/>
+      <w:numFmt w:val="bullet"/>
+      <w:lvlText w:val="o"/>
+      <w:lvlJc w:val="left"/>
+      <w:pPr>
+        <w:ind w:left="1440" w:hanging="360"/>
+      </w:pPr>
+      <w:rPr>
+        <w:rFonts w:ascii="Courier New" w:hAnsi="Courier New" w:cs="Courier New" w:hint="default"/>
+      </w:rPr>
+    </w:lvl>
+    <w:lvl w:ilvl="2" w:tplc="04090005" w:tentative="1">
+      <w:start w:val="1"/>
+      <w:numFmt w:val="bullet"/>
+      <w:lvlText w:val=""/>
+      <w:lvlJc w:val="left"/>
+      <w:pPr>
+        <w:ind w:left="2160" w:hanging="360"/>
+      </w:pPr>
+      <w:rPr>
+        <w:rFonts w:ascii="Wingdings" w:hAnsi="Wingdings" w:hint="default"/>
+      </w:rPr>
+    </w:lvl>
+    <w:lvl w:ilvl="3" w:tplc="04090001" w:tentative="1">
+      <w:start w:val="1"/>
+      <w:numFmt w:val="bullet"/>
+      <w:lvlText w:val=""/>
+      <w:lvlJc w:val="left"/>
+      <w:pPr>
+        <w:ind w:left="2880" w:hanging="360"/>
+      </w:pPr>
+      <w:rPr>
+        <w:rFonts w:ascii="Symbol" w:hAnsi="Symbol" w:hint="default"/>
+      </w:rPr>
+    </w:lvl>
+    <w:lvl w:ilvl="4" w:tplc="04090003" w:tentative="1">
+      <w:start w:val="1"/>
+      <w:numFmt w:val="bullet"/>
+      <w:lvlText w:val="o"/>
+      <w:lvlJc w:val="left"/>
+      <w:pPr>
+        <w:ind w:left="3600" w:hanging="360"/>
+      </w:pPr>
+      <w:rPr>
+        <w:rFonts w:ascii="Courier New" w:hAnsi="Courier New" w:cs="Courier New" w:hint="default"/>
+      </w:rPr>
+    </w:lvl>
+    <w:lvl w:ilvl="5" w:tplc="04090005" w:tentative="1">
+      <w:start w:val="1"/>
+      <w:numFmt w:val="bullet"/>
+      <w:lvlText w:val=""/>
+      <w:lvlJc w:val="left"/>
+      <w:pPr>
+        <w:ind w:left="4320" w:hanging="360"/>
+      </w:pPr>
+      <w:rPr>
+        <w:rFonts w:ascii="Wingdings" w:hAnsi="Wingdings" w:hint="default"/>
+      </w:rPr>
+    </w:lvl>
+    <w:lvl w:ilvl="6" w:tplc="04090001" w:tentative="1">
+      <w:start w:val="1"/>
+      <w:numFmt w:val="bullet"/>
+      <w:lvlText w:val=""/>
+      <w:lvlJc w:val="left"/>
+      <w:pPr>
+        <w:ind w:left="5040" w:hanging="360"/>
+      </w:pPr>
+      <w:rPr>
+        <w:rFonts w:ascii="Symbol" w:hAnsi="Symbol" w:hint="default"/>
+      </w:rPr>
+    </w:lvl>
+    <w:lvl w:ilvl="7" w:tplc="04090003" w:tentative="1">
+      <w:start w:val="1"/>
+      <w:numFmt w:val="bullet"/>
+      <w:lvlText w:val="o"/>
+      <w:lvlJc w:val="left"/>
+      <w:pPr>
+        <w:ind w:left="5760" w:hanging="360"/>
+      </w:pPr>
+      <w:rPr>
+        <w:rFonts w:ascii="Courier New" w:hAnsi="Courier New" w:cs="Courier New" w:hint="default"/>
+      </w:rPr>
+    </w:lvl>
+    <w:lvl w:ilvl="8" w:tplc="04090005" w:tentative="1">
+      <w:start w:val="1"/>
+      <w:numFmt w:val="bullet"/>
+      <w:lvlText w:val=""/>
+      <w:lvlJc w:val="left"/>
+      <w:pPr>
+        <w:ind w:left="6480" w:hanging="360"/>
+      </w:pPr>
+      <w:rPr>
+        <w:rFonts w:ascii="Wingdings" w:hAnsi="Wingdings" w:hint="default"/>
+      </w:rPr>
+    </w:lvl>
+  </w:abstractNum>
+  <w:abstractNum w:abstractNumId="2" w15:restartNumberingAfterBreak="0">
     <w:nsid w:val="14BE705C"/>
     <w:multiLevelType w:val="multilevel"/>
     <w:tmpl w:val="74288186"/>
@@ -4794,7 +5315,7 @@
       </w:rPr>
     </w:lvl>
   </w:abstractNum>
-  <w:abstractNum w:abstractNumId="2" w15:restartNumberingAfterBreak="0">
+  <w:abstractNum w:abstractNumId="3" w15:restartNumberingAfterBreak="0">
     <w:nsid w:val="1F9D74CF"/>
     <w:multiLevelType w:val="hybridMultilevel"/>
     <w:tmpl w:val="02107274"/>
@@ -4907,7 +5428,7 @@
       </w:rPr>
     </w:lvl>
   </w:abstractNum>
-  <w:abstractNum w:abstractNumId="3" w15:restartNumberingAfterBreak="0">
+  <w:abstractNum w:abstractNumId="4" w15:restartNumberingAfterBreak="0">
     <w:nsid w:val="28C669A1"/>
     <w:multiLevelType w:val="hybridMultilevel"/>
     <w:tmpl w:val="1F94B9A8"/>
@@ -5019,7 +5540,7 @@
       </w:rPr>
     </w:lvl>
   </w:abstractNum>
-  <w:abstractNum w:abstractNumId="4" w15:restartNumberingAfterBreak="0">
+  <w:abstractNum w:abstractNumId="5" w15:restartNumberingAfterBreak="0">
     <w:nsid w:val="307406FC"/>
     <w:multiLevelType w:val="hybridMultilevel"/>
     <w:tmpl w:val="3E8CFC0A"/>
@@ -5132,7 +5653,7 @@
       </w:rPr>
     </w:lvl>
   </w:abstractNum>
-  <w:abstractNum w:abstractNumId="5" w15:restartNumberingAfterBreak="0">
+  <w:abstractNum w:abstractNumId="6" w15:restartNumberingAfterBreak="0">
     <w:nsid w:val="316D4E96"/>
     <w:multiLevelType w:val="hybridMultilevel"/>
     <w:tmpl w:val="548E2EA2"/>
@@ -5245,7 +5766,7 @@
       </w:rPr>
     </w:lvl>
   </w:abstractNum>
-  <w:abstractNum w:abstractNumId="6" w15:restartNumberingAfterBreak="0">
+  <w:abstractNum w:abstractNumId="7" w15:restartNumberingAfterBreak="0">
     <w:nsid w:val="352A56B0"/>
     <w:multiLevelType w:val="hybridMultilevel"/>
     <w:tmpl w:val="1BEC6F32"/>
@@ -5334,7 +5855,7 @@
       </w:pPr>
     </w:lvl>
   </w:abstractNum>
-  <w:abstractNum w:abstractNumId="7" w15:restartNumberingAfterBreak="0">
+  <w:abstractNum w:abstractNumId="8" w15:restartNumberingAfterBreak="0">
     <w:nsid w:val="39A06615"/>
     <w:multiLevelType w:val="hybridMultilevel"/>
     <w:tmpl w:val="6C1C0ABE"/>
@@ -5350,7 +5871,7 @@
         <w:rFonts w:ascii="Symbol" w:hAnsi="Symbol" w:hint="default"/>
       </w:rPr>
     </w:lvl>
-    <w:lvl w:ilvl="1" w:tplc="04090003" w:tentative="1">
+    <w:lvl w:ilvl="1" w:tplc="04090003">
       <w:start w:val="1"/>
       <w:numFmt w:val="bullet"/>
       <w:lvlText w:val="o"/>
@@ -5447,7 +5968,7 @@
       </w:rPr>
     </w:lvl>
   </w:abstractNum>
-  <w:abstractNum w:abstractNumId="8" w15:restartNumberingAfterBreak="0">
+  <w:abstractNum w:abstractNumId="9" w15:restartNumberingAfterBreak="0">
     <w:nsid w:val="486F20C9"/>
     <w:multiLevelType w:val="multilevel"/>
     <w:tmpl w:val="0ADE2FDC"/>
@@ -5596,7 +6117,7 @@
       </w:rPr>
     </w:lvl>
   </w:abstractNum>
-  <w:abstractNum w:abstractNumId="9" w15:restartNumberingAfterBreak="0">
+  <w:abstractNum w:abstractNumId="10" w15:restartNumberingAfterBreak="0">
     <w:nsid w:val="51265598"/>
     <w:multiLevelType w:val="hybridMultilevel"/>
     <w:tmpl w:val="35DA7EB8"/>
@@ -5709,7 +6230,7 @@
       </w:rPr>
     </w:lvl>
   </w:abstractNum>
-  <w:abstractNum w:abstractNumId="10" w15:restartNumberingAfterBreak="0">
+  <w:abstractNum w:abstractNumId="11" w15:restartNumberingAfterBreak="0">
     <w:nsid w:val="52B24FCA"/>
     <w:multiLevelType w:val="hybridMultilevel"/>
     <w:tmpl w:val="597EA138"/>
@@ -5798,7 +6319,7 @@
       </w:pPr>
     </w:lvl>
   </w:abstractNum>
-  <w:abstractNum w:abstractNumId="11" w15:restartNumberingAfterBreak="0">
+  <w:abstractNum w:abstractNumId="12" w15:restartNumberingAfterBreak="0">
     <w:nsid w:val="57F51F83"/>
     <w:multiLevelType w:val="hybridMultilevel"/>
     <w:tmpl w:val="2F842B9E"/>
@@ -5911,7 +6432,7 @@
       </w:rPr>
     </w:lvl>
   </w:abstractNum>
-  <w:abstractNum w:abstractNumId="12" w15:restartNumberingAfterBreak="0">
+  <w:abstractNum w:abstractNumId="13" w15:restartNumberingAfterBreak="0">
     <w:nsid w:val="5DA66B0E"/>
     <w:multiLevelType w:val="hybridMultilevel"/>
     <w:tmpl w:val="84D0897C"/>
@@ -6024,7 +6545,7 @@
       </w:rPr>
     </w:lvl>
   </w:abstractNum>
-  <w:abstractNum w:abstractNumId="13" w15:restartNumberingAfterBreak="0">
+  <w:abstractNum w:abstractNumId="14" w15:restartNumberingAfterBreak="0">
     <w:nsid w:val="63E04BB9"/>
     <w:multiLevelType w:val="hybridMultilevel"/>
     <w:tmpl w:val="E4925C0C"/>
@@ -6113,7 +6634,7 @@
       </w:pPr>
     </w:lvl>
   </w:abstractNum>
-  <w:abstractNum w:abstractNumId="14" w15:restartNumberingAfterBreak="0">
+  <w:abstractNum w:abstractNumId="15" w15:restartNumberingAfterBreak="0">
     <w:nsid w:val="6C332A29"/>
     <w:multiLevelType w:val="hybridMultilevel"/>
     <w:tmpl w:val="B2E2F51E"/>
@@ -6129,7 +6650,7 @@
         <w:rFonts w:ascii="Symbol" w:hAnsi="Symbol" w:hint="default"/>
       </w:rPr>
     </w:lvl>
-    <w:lvl w:ilvl="1" w:tplc="04090003" w:tentative="1">
+    <w:lvl w:ilvl="1" w:tplc="04090003">
       <w:start w:val="1"/>
       <w:numFmt w:val="bullet"/>
       <w:lvlText w:val="o"/>
@@ -6226,7 +6747,7 @@
       </w:rPr>
     </w:lvl>
   </w:abstractNum>
-  <w:abstractNum w:abstractNumId="15" w15:restartNumberingAfterBreak="0">
+  <w:abstractNum w:abstractNumId="16" w15:restartNumberingAfterBreak="0">
     <w:nsid w:val="73782144"/>
     <w:multiLevelType w:val="hybridMultilevel"/>
     <w:tmpl w:val="713EE082"/>
@@ -6315,7 +6836,7 @@
       </w:pPr>
     </w:lvl>
   </w:abstractNum>
-  <w:abstractNum w:abstractNumId="16" w15:restartNumberingAfterBreak="0">
+  <w:abstractNum w:abstractNumId="17" w15:restartNumberingAfterBreak="0">
     <w:nsid w:val="78605E43"/>
     <w:multiLevelType w:val="hybridMultilevel"/>
     <w:tmpl w:val="E4EE2792"/>
@@ -6428,7 +6949,7 @@
       </w:rPr>
     </w:lvl>
   </w:abstractNum>
-  <w:abstractNum w:abstractNumId="17" w15:restartNumberingAfterBreak="0">
+  <w:abstractNum w:abstractNumId="18" w15:restartNumberingAfterBreak="0">
     <w:nsid w:val="7FB228F4"/>
     <w:multiLevelType w:val="hybridMultilevel"/>
     <w:tmpl w:val="C79C3B26"/>
@@ -6542,58 +7063,61 @@
     </w:lvl>
   </w:abstractNum>
   <w:num w:numId="1" w16cid:durableId="641009935">
-    <w:abstractNumId w:val="12"/>
+    <w:abstractNumId w:val="13"/>
   </w:num>
   <w:num w:numId="2" w16cid:durableId="629628107">
+    <w:abstractNumId w:val="16"/>
+  </w:num>
+  <w:num w:numId="3" w16cid:durableId="1544253074">
     <w:abstractNumId w:val="15"/>
   </w:num>
-  <w:num w:numId="3" w16cid:durableId="1544253074">
-    <w:abstractNumId w:val="14"/>
-  </w:num>
   <w:num w:numId="4" w16cid:durableId="1883246340">
-    <w:abstractNumId w:val="9"/>
+    <w:abstractNumId w:val="10"/>
   </w:num>
   <w:num w:numId="5" w16cid:durableId="1911845860">
     <w:abstractNumId w:val="0"/>
   </w:num>
   <w:num w:numId="6" w16cid:durableId="985935241">
+    <w:abstractNumId w:val="8"/>
+  </w:num>
+  <w:num w:numId="7" w16cid:durableId="1833644099">
+    <w:abstractNumId w:val="6"/>
+  </w:num>
+  <w:num w:numId="8" w16cid:durableId="862747939">
+    <w:abstractNumId w:val="11"/>
+  </w:num>
+  <w:num w:numId="9" w16cid:durableId="836044604">
+    <w:abstractNumId w:val="12"/>
+  </w:num>
+  <w:num w:numId="10" w16cid:durableId="282343239">
+    <w:abstractNumId w:val="3"/>
+  </w:num>
+  <w:num w:numId="11" w16cid:durableId="290483838">
+    <w:abstractNumId w:val="5"/>
+  </w:num>
+  <w:num w:numId="12" w16cid:durableId="1816602834">
+    <w:abstractNumId w:val="17"/>
+  </w:num>
+  <w:num w:numId="13" w16cid:durableId="1666474314">
+    <w:abstractNumId w:val="4"/>
+  </w:num>
+  <w:num w:numId="14" w16cid:durableId="305550696">
+    <w:abstractNumId w:val="2"/>
+  </w:num>
+  <w:num w:numId="15" w16cid:durableId="859509215">
+    <w:abstractNumId w:val="9"/>
+  </w:num>
+  <w:num w:numId="16" w16cid:durableId="1757969202">
+    <w:abstractNumId w:val="14"/>
+  </w:num>
+  <w:num w:numId="17" w16cid:durableId="129172997">
     <w:abstractNumId w:val="7"/>
   </w:num>
-  <w:num w:numId="7" w16cid:durableId="1833644099">
-    <w:abstractNumId w:val="5"/>
+  <w:num w:numId="18" w16cid:durableId="930503835">
+    <w:abstractNumId w:val="18"/>
   </w:num>
-  <w:num w:numId="8" w16cid:durableId="862747939">
-    <w:abstractNumId w:val="10"/>
-  </w:num>
-  <w:num w:numId="9" w16cid:durableId="836044604">
-    <w:abstractNumId w:val="11"/>
-  </w:num>
-  <w:num w:numId="10" w16cid:durableId="282343239">
-    <w:abstractNumId w:val="2"/>
-  </w:num>
-  <w:num w:numId="11" w16cid:durableId="290483838">
-    <w:abstractNumId w:val="4"/>
-  </w:num>
-  <w:num w:numId="12" w16cid:durableId="1816602834">
-    <w:abstractNumId w:val="16"/>
-  </w:num>
-  <w:num w:numId="13" w16cid:durableId="1666474314">
-    <w:abstractNumId w:val="3"/>
-  </w:num>
-  <w:num w:numId="14" w16cid:durableId="305550696">
+  <w:num w:numId="19" w16cid:durableId="1862696892">
     <w:abstractNumId w:val="1"/>
-  </w:num>
-  <w:num w:numId="15" w16cid:durableId="859509215">
-    <w:abstractNumId w:val="8"/>
-  </w:num>
-  <w:num w:numId="16" w16cid:durableId="1757969202">
-    <w:abstractNumId w:val="13"/>
-  </w:num>
-  <w:num w:numId="17" w16cid:durableId="129172997">
-    <w:abstractNumId w:val="6"/>
-  </w:num>
-  <w:num w:numId="18" w16cid:durableId="930503835">
-    <w:abstractNumId w:val="17"/>
   </w:num>
 </w:numbering>
 </file>
@@ -7396,12 +7920,9 @@
 </file>
 
 <file path=customXml/item1.xml><?xml version="1.0" encoding="utf-8"?>
-<?mso-contentType ?>
-<FormTemplates xmlns="http://schemas.microsoft.com/sharepoint/v3/contenttype/forms">
-  <Display>DocumentLibraryForm</Display>
-  <Edit>DocumentLibraryForm</Edit>
-  <New>DocumentLibraryForm</New>
-</FormTemplates>
+<p:properties xmlns:p="http://schemas.microsoft.com/office/2006/metadata/properties" xmlns:xsi="http://www.w3.org/2001/XMLSchema-instance" xmlns:pc="http://schemas.microsoft.com/office/infopath/2007/PartnerControls">
+  <documentManagement/>
+</p:properties>
 </file>
 
 <file path=customXml/item2.xml><?xml version="1.0" encoding="utf-8"?>
@@ -7622,15 +8143,19 @@
 </file>
 
 <file path=customXml/item3.xml><?xml version="1.0" encoding="utf-8"?>
-<p:properties xmlns:p="http://schemas.microsoft.com/office/2006/metadata/properties" xmlns:xsi="http://www.w3.org/2001/XMLSchema-instance" xmlns:pc="http://schemas.microsoft.com/office/infopath/2007/PartnerControls">
-  <documentManagement/>
-</p:properties>
+<?mso-contentType ?>
+<FormTemplates xmlns="http://schemas.microsoft.com/sharepoint/v3/contenttype/forms">
+  <Display>DocumentLibraryForm</Display>
+  <Edit>DocumentLibraryForm</Edit>
+  <New>DocumentLibraryForm</New>
+</FormTemplates>
 </file>
 
 <file path=customXml/itemProps1.xml><?xml version="1.0" encoding="utf-8"?>
-<ds:datastoreItem xmlns:ds="http://schemas.openxmlformats.org/officeDocument/2006/customXml" ds:itemID="{D7915161-0AAD-4969-9782-9535F3403F80}">
+<ds:datastoreItem xmlns:ds="http://schemas.openxmlformats.org/officeDocument/2006/customXml" ds:itemID="{6A96715F-8BF0-4764-9F27-E31A99D8643C}">
   <ds:schemaRefs>
-    <ds:schemaRef ds:uri="http://schemas.microsoft.com/sharepoint/v3/contenttype/forms"/>
+    <ds:schemaRef ds:uri="http://schemas.microsoft.com/office/2006/metadata/properties"/>
+    <ds:schemaRef ds:uri="http://schemas.microsoft.com/office/infopath/2007/PartnerControls"/>
   </ds:schemaRefs>
 </ds:datastoreItem>
 </file>
@@ -7655,10 +8180,9 @@
 </file>
 
 <file path=customXml/itemProps3.xml><?xml version="1.0" encoding="utf-8"?>
-<ds:datastoreItem xmlns:ds="http://schemas.openxmlformats.org/officeDocument/2006/customXml" ds:itemID="{6A96715F-8BF0-4764-9F27-E31A99D8643C}">
+<ds:datastoreItem xmlns:ds="http://schemas.openxmlformats.org/officeDocument/2006/customXml" ds:itemID="{D7915161-0AAD-4969-9782-9535F3403F80}">
   <ds:schemaRefs>
-    <ds:schemaRef ds:uri="http://schemas.microsoft.com/office/2006/metadata/properties"/>
-    <ds:schemaRef ds:uri="http://schemas.microsoft.com/office/infopath/2007/PartnerControls"/>
+    <ds:schemaRef ds:uri="http://schemas.microsoft.com/sharepoint/v3/contenttype/forms"/>
   </ds:schemaRefs>
 </ds:datastoreItem>
 </file>
</xml_diff>

<commit_message>
docs: minor tweaks, sample template cleanup
</commit_message>
<xml_diff>
--- a/docs/sample-template.docx
+++ b/docs/sample-template.docx
@@ -91,25 +91,7 @@
           <w:sz w:val="24"/>
           <w:szCs w:val="24"/>
         </w:rPr>
-        <w:t xml:space="preserve"> Dagmar </w:t>
-      </w:r>
-      <w:proofErr w:type="spellStart"/>
-      <w:r>
-        <w:rPr>
-          <w:b w:val="0"/>
-          <w:sz w:val="24"/>
-          <w:szCs w:val="24"/>
-        </w:rPr>
-        <w:t>Bukovska</w:t>
-      </w:r>
-      <w:proofErr w:type="spellEnd"/>
-      <w:r>
-        <w:rPr>
-          <w:b w:val="0"/>
-          <w:sz w:val="24"/>
-          <w:szCs w:val="24"/>
-        </w:rPr>
-        <w:t xml:space="preserve"> (Dasha)</w:t>
+        <w:t xml:space="preserve"> </w:t>
       </w:r>
     </w:p>
     <w:p>
@@ -140,14 +122,6 @@
           <w:szCs w:val="24"/>
         </w:rPr>
         <w:t xml:space="preserve">Faculty: </w:t>
-      </w:r>
-      <w:r>
-        <w:rPr>
-          <w:b w:val="0"/>
-          <w:sz w:val="24"/>
-          <w:szCs w:val="24"/>
-        </w:rPr>
-        <w:t>Prof. Pawlak and others</w:t>
       </w:r>
     </w:p>
     <w:p>
@@ -7920,9 +7894,12 @@
 </file>
 
 <file path=customXml/item1.xml><?xml version="1.0" encoding="utf-8"?>
-<p:properties xmlns:p="http://schemas.microsoft.com/office/2006/metadata/properties" xmlns:xsi="http://www.w3.org/2001/XMLSchema-instance" xmlns:pc="http://schemas.microsoft.com/office/infopath/2007/PartnerControls">
-  <documentManagement/>
-</p:properties>
+<?mso-contentType ?>
+<FormTemplates xmlns="http://schemas.microsoft.com/sharepoint/v3/contenttype/forms">
+  <Display>DocumentLibraryForm</Display>
+  <Edit>DocumentLibraryForm</Edit>
+  <New>DocumentLibraryForm</New>
+</FormTemplates>
 </file>
 
 <file path=customXml/item2.xml><?xml version="1.0" encoding="utf-8"?>
@@ -8143,19 +8120,15 @@
 </file>
 
 <file path=customXml/item3.xml><?xml version="1.0" encoding="utf-8"?>
-<?mso-contentType ?>
-<FormTemplates xmlns="http://schemas.microsoft.com/sharepoint/v3/contenttype/forms">
-  <Display>DocumentLibraryForm</Display>
-  <Edit>DocumentLibraryForm</Edit>
-  <New>DocumentLibraryForm</New>
-</FormTemplates>
+<p:properties xmlns:p="http://schemas.microsoft.com/office/2006/metadata/properties" xmlns:xsi="http://www.w3.org/2001/XMLSchema-instance" xmlns:pc="http://schemas.microsoft.com/office/infopath/2007/PartnerControls">
+  <documentManagement/>
+</p:properties>
 </file>
 
 <file path=customXml/itemProps1.xml><?xml version="1.0" encoding="utf-8"?>
-<ds:datastoreItem xmlns:ds="http://schemas.openxmlformats.org/officeDocument/2006/customXml" ds:itemID="{6A96715F-8BF0-4764-9F27-E31A99D8643C}">
+<ds:datastoreItem xmlns:ds="http://schemas.openxmlformats.org/officeDocument/2006/customXml" ds:itemID="{D7915161-0AAD-4969-9782-9535F3403F80}">
   <ds:schemaRefs>
-    <ds:schemaRef ds:uri="http://schemas.microsoft.com/office/2006/metadata/properties"/>
-    <ds:schemaRef ds:uri="http://schemas.microsoft.com/office/infopath/2007/PartnerControls"/>
+    <ds:schemaRef ds:uri="http://schemas.microsoft.com/sharepoint/v3/contenttype/forms"/>
   </ds:schemaRefs>
 </ds:datastoreItem>
 </file>
@@ -8180,9 +8153,10 @@
 </file>
 
 <file path=customXml/itemProps3.xml><?xml version="1.0" encoding="utf-8"?>
-<ds:datastoreItem xmlns:ds="http://schemas.openxmlformats.org/officeDocument/2006/customXml" ds:itemID="{D7915161-0AAD-4969-9782-9535F3403F80}">
+<ds:datastoreItem xmlns:ds="http://schemas.openxmlformats.org/officeDocument/2006/customXml" ds:itemID="{6A96715F-8BF0-4764-9F27-E31A99D8643C}">
   <ds:schemaRefs>
-    <ds:schemaRef ds:uri="http://schemas.microsoft.com/sharepoint/v3/contenttype/forms"/>
+    <ds:schemaRef ds:uri="http://schemas.microsoft.com/office/2006/metadata/properties"/>
+    <ds:schemaRef ds:uri="http://schemas.microsoft.com/office/infopath/2007/PartnerControls"/>
   </ds:schemaRefs>
 </ds:datastoreItem>
 </file>
</xml_diff>